<commit_message>
Types of Programming Languages
</commit_message>
<xml_diff>
--- a/4. Software/Notes.docx
+++ b/4. Software/Notes.docx
@@ -32,7 +32,23 @@
           <w:sz w:val="24"/>
           <w:szCs w:val="24"/>
         </w:rPr>
-        <w:t xml:space="preserve">The operating system gives the users an interface to communicate with the computers. The interface allows the user to input the data and see the output of the data. Interfaces is of different types. </w:t>
+        <w:t xml:space="preserve">The operating system gives the users an interface to communicate with the computers. The interface allows the user to input the data and see the output of the data. Interfaces </w:t>
+      </w:r>
+      <w:proofErr w:type="gramStart"/>
+      <w:r>
+        <w:rPr>
+          <w:sz w:val="24"/>
+          <w:szCs w:val="24"/>
+        </w:rPr>
+        <w:t>is</w:t>
+      </w:r>
+      <w:proofErr w:type="gramEnd"/>
+      <w:r>
+        <w:rPr>
+          <w:sz w:val="24"/>
+          <w:szCs w:val="24"/>
+        </w:rPr>
+        <w:t xml:space="preserve"> of different types. </w:t>
       </w:r>
     </w:p>
     <w:p>
@@ -319,7 +335,23 @@
           <w:sz w:val="24"/>
           <w:szCs w:val="24"/>
         </w:rPr>
-        <w:t>Operating systems allows multiple users to do their work on a single computer without even touch the data of the other users. Operating systems allows the users to make their accounts by their separate name and password. Every user enter their own name and password and done with their works on their own account by a shared computer system.</w:t>
+        <w:t xml:space="preserve">Operating systems allows multiple users to do their work on a single computer without even touch the data of the other users. Operating systems allows the users to make their accounts by their separate name and password. Every user </w:t>
+      </w:r>
+      <w:proofErr w:type="gramStart"/>
+      <w:r>
+        <w:rPr>
+          <w:sz w:val="24"/>
+          <w:szCs w:val="24"/>
+        </w:rPr>
+        <w:t>enter</w:t>
+      </w:r>
+      <w:proofErr w:type="gramEnd"/>
+      <w:r>
+        <w:rPr>
+          <w:sz w:val="24"/>
+          <w:szCs w:val="24"/>
+        </w:rPr>
+        <w:t xml:space="preserve"> their own name and password and done with their works on their own account by a shared computer system.</w:t>
       </w:r>
     </w:p>
     <w:p>
@@ -515,7 +547,23 @@
                 <w:sz w:val="24"/>
                 <w:szCs w:val="24"/>
               </w:rPr>
-              <w:t>Two process trying to access the same memory point at the same point.</w:t>
+              <w:t xml:space="preserve">Two </w:t>
+            </w:r>
+            <w:proofErr w:type="gramStart"/>
+            <w:r>
+              <w:rPr>
+                <w:sz w:val="24"/>
+                <w:szCs w:val="24"/>
+              </w:rPr>
+              <w:t>process</w:t>
+            </w:r>
+            <w:proofErr w:type="gramEnd"/>
+            <w:r>
+              <w:rPr>
+                <w:sz w:val="24"/>
+                <w:szCs w:val="24"/>
+              </w:rPr>
+              <w:t xml:space="preserve"> trying to access the same memory point at the same point.</w:t>
             </w:r>
           </w:p>
         </w:tc>
@@ -645,8 +693,483 @@
           <w:sz w:val="24"/>
           <w:szCs w:val="24"/>
         </w:rPr>
-        <w:t>There are two types of the interrupt based on priority, the high-priority and the low priority. The high-priority interrupt needs attention quickly. For example, hardware failure, virus detection. While the low-priority interrupt are the handle by interrupt handle, it in necessary to give attention to it but not like high-level interruptions. For example, data input.</w:t>
-      </w:r>
+        <w:t xml:space="preserve">There are two types of the interrupt based on priority, the high-priority and the low priority. The high-priority interrupt needs attention quickly. For example, hardware failure, virus detection. While the low-priority interrupt </w:t>
+      </w:r>
+      <w:proofErr w:type="gramStart"/>
+      <w:r>
+        <w:rPr>
+          <w:sz w:val="24"/>
+          <w:szCs w:val="24"/>
+        </w:rPr>
+        <w:t>are</w:t>
+      </w:r>
+      <w:proofErr w:type="gramEnd"/>
+      <w:r>
+        <w:rPr>
+          <w:sz w:val="24"/>
+          <w:szCs w:val="24"/>
+        </w:rPr>
+        <w:t xml:space="preserve"> the handle by interrupt handle, it </w:t>
+      </w:r>
+      <w:proofErr w:type="spellStart"/>
+      <w:r>
+        <w:rPr>
+          <w:sz w:val="24"/>
+          <w:szCs w:val="24"/>
+        </w:rPr>
+        <w:t>in</w:t>
+      </w:r>
+      <w:proofErr w:type="spellEnd"/>
+      <w:r>
+        <w:rPr>
+          <w:sz w:val="24"/>
+          <w:szCs w:val="24"/>
+        </w:rPr>
+        <w:t xml:space="preserve"> necessary to give attention to it but not like high-level interruptions. For example, data input.</w:t>
+      </w:r>
+    </w:p>
+    <w:p>
+      <w:pPr>
+        <w:rPr>
+          <w:sz w:val="24"/>
+          <w:szCs w:val="24"/>
+        </w:rPr>
+      </w:pPr>
+    </w:p>
+    <w:p>
+      <w:pPr>
+        <w:rPr>
+          <w:sz w:val="24"/>
+          <w:szCs w:val="24"/>
+        </w:rPr>
+      </w:pPr>
+    </w:p>
+    <w:p>
+      <w:pPr>
+        <w:pStyle w:val="Heading1"/>
+      </w:pPr>
+      <w:r>
+        <w:t>Types of Programming Languages</w:t>
+      </w:r>
+    </w:p>
+    <w:p>
+      <w:pPr>
+        <w:rPr>
+          <w:sz w:val="24"/>
+          <w:szCs w:val="24"/>
+        </w:rPr>
+      </w:pPr>
+    </w:p>
+    <w:p>
+      <w:pPr>
+        <w:rPr>
+          <w:sz w:val="24"/>
+          <w:szCs w:val="24"/>
+        </w:rPr>
+      </w:pPr>
+      <w:r>
+        <w:rPr>
+          <w:sz w:val="24"/>
+          <w:szCs w:val="24"/>
+        </w:rPr>
+        <w:t xml:space="preserve">There are two types of programming languages. </w:t>
+      </w:r>
+    </w:p>
+    <w:p>
+      <w:pPr>
+        <w:pStyle w:val="ListParagraph"/>
+        <w:numPr>
+          <w:ilvl w:val="0"/>
+          <w:numId w:val="3"/>
+        </w:numPr>
+        <w:rPr>
+          <w:sz w:val="24"/>
+          <w:szCs w:val="24"/>
+        </w:rPr>
+      </w:pPr>
+      <w:r>
+        <w:rPr>
+          <w:sz w:val="24"/>
+          <w:szCs w:val="24"/>
+        </w:rPr>
+        <w:t>High-level</w:t>
+      </w:r>
+    </w:p>
+    <w:p>
+      <w:pPr>
+        <w:pStyle w:val="ListParagraph"/>
+        <w:numPr>
+          <w:ilvl w:val="0"/>
+          <w:numId w:val="3"/>
+        </w:numPr>
+        <w:rPr>
+          <w:sz w:val="24"/>
+          <w:szCs w:val="24"/>
+        </w:rPr>
+      </w:pPr>
+      <w:r>
+        <w:rPr>
+          <w:sz w:val="24"/>
+          <w:szCs w:val="24"/>
+        </w:rPr>
+        <w:t>Low-level</w:t>
+      </w:r>
+    </w:p>
+    <w:p>
+      <w:pPr>
+        <w:pStyle w:val="ListParagraph"/>
+      </w:pPr>
+    </w:p>
+    <w:p>
+      <w:pPr>
+        <w:pStyle w:val="Heading2"/>
+      </w:pPr>
+      <w:r>
+        <w:t>High-level Programming languages.</w:t>
+      </w:r>
+    </w:p>
+    <w:p>
+      <w:pPr>
+        <w:rPr>
+          <w:sz w:val="24"/>
+          <w:szCs w:val="24"/>
+        </w:rPr>
+      </w:pPr>
+      <w:r>
+        <w:rPr>
+          <w:sz w:val="24"/>
+          <w:szCs w:val="24"/>
+        </w:rPr>
+        <w:t xml:space="preserve">High-level languages </w:t>
+      </w:r>
+      <w:proofErr w:type="gramStart"/>
+      <w:r>
+        <w:rPr>
+          <w:sz w:val="24"/>
+          <w:szCs w:val="24"/>
+        </w:rPr>
+        <w:t>uses</w:t>
+      </w:r>
+      <w:proofErr w:type="gramEnd"/>
+      <w:r>
+        <w:rPr>
+          <w:sz w:val="24"/>
+          <w:szCs w:val="24"/>
+        </w:rPr>
+        <w:t xml:space="preserve"> natural human languages its instructions and syntaxes. For example, it could be just simple English words like if, for, while, input, print and so on. The examples are: Python (</w:t>
+      </w:r>
+      <w:hyperlink r:id="rId6" w:history="1">
+        <w:r>
+          <w:rPr>
+            <w:rStyle w:val="Hyperlink"/>
+            <w:sz w:val="24"/>
+            <w:szCs w:val="24"/>
+          </w:rPr>
+          <w:t>https://github.com/anwar-513/Programming-Fundamental-Tasks/blob/main/5.5_high-</w:t>
+        </w:r>
+        <w:r>
+          <w:rPr>
+            <w:rStyle w:val="Hyperlink"/>
+            <w:sz w:val="24"/>
+            <w:szCs w:val="24"/>
+          </w:rPr>
+          <w:lastRenderedPageBreak/>
+          <w:t>level.py</w:t>
+        </w:r>
+      </w:hyperlink>
+      <w:r>
+        <w:rPr>
+          <w:sz w:val="24"/>
+          <w:szCs w:val="24"/>
+        </w:rPr>
+        <w:t>), or VB.NET (</w:t>
+      </w:r>
+      <w:hyperlink r:id="rId7" w:history="1">
+        <w:r>
+          <w:rPr>
+            <w:rStyle w:val="Hyperlink"/>
+            <w:sz w:val="24"/>
+            <w:szCs w:val="24"/>
+          </w:rPr>
+          <w:t>https://github.com/anwar-513/Programming-Fundamental-Tasks/blob/main/5.</w:t>
+        </w:r>
+        <w:r>
+          <w:rPr>
+            <w:rStyle w:val="Hyperlink"/>
+            <w:sz w:val="24"/>
+            <w:szCs w:val="24"/>
+          </w:rPr>
+          <w:t>6</w:t>
+        </w:r>
+        <w:r>
+          <w:rPr>
+            <w:rStyle w:val="Hyperlink"/>
+            <w:sz w:val="24"/>
+            <w:szCs w:val="24"/>
+          </w:rPr>
+          <w:t>_high-level.</w:t>
+        </w:r>
+        <w:r>
+          <w:rPr>
+            <w:rStyle w:val="Hyperlink"/>
+            <w:sz w:val="24"/>
+            <w:szCs w:val="24"/>
+          </w:rPr>
+          <w:t>vb</w:t>
+        </w:r>
+      </w:hyperlink>
+      <w:r>
+        <w:rPr>
+          <w:sz w:val="24"/>
+          <w:szCs w:val="24"/>
+        </w:rPr>
+        <w:t xml:space="preserve">). </w:t>
+      </w:r>
+    </w:p>
+    <w:p>
+      <w:pPr>
+        <w:rPr>
+          <w:sz w:val="24"/>
+          <w:szCs w:val="24"/>
+        </w:rPr>
+      </w:pPr>
+      <w:r>
+        <w:rPr>
+          <w:sz w:val="24"/>
+          <w:szCs w:val="24"/>
+        </w:rPr>
+        <w:t>The programs of high</w:t>
+      </w:r>
+      <w:r>
+        <w:rPr>
+          <w:sz w:val="24"/>
+          <w:szCs w:val="24"/>
+        </w:rPr>
+        <w:t>-</w:t>
+      </w:r>
+      <w:r>
+        <w:rPr>
+          <w:sz w:val="24"/>
+          <w:szCs w:val="24"/>
+        </w:rPr>
+        <w:t xml:space="preserve">level languages are portable means that it can be written on one computer and can be run on another computer. </w:t>
+      </w:r>
+    </w:p>
+    <w:p>
+      <w:pPr>
+        <w:rPr>
+          <w:sz w:val="24"/>
+          <w:szCs w:val="24"/>
+        </w:rPr>
+      </w:pPr>
+    </w:p>
+    <w:p>
+      <w:pPr>
+        <w:pStyle w:val="Heading2"/>
+      </w:pPr>
+      <w:r>
+        <w:t>Low-level Programming Languages.</w:t>
+      </w:r>
+    </w:p>
+    <w:p/>
+    <w:p>
+      <w:pPr>
+        <w:rPr>
+          <w:sz w:val="24"/>
+          <w:szCs w:val="24"/>
+        </w:rPr>
+      </w:pPr>
+      <w:r>
+        <w:rPr>
+          <w:sz w:val="24"/>
+          <w:szCs w:val="24"/>
+        </w:rPr>
+        <w:t>The low-level language consist</w:t>
+      </w:r>
+      <w:r>
+        <w:rPr>
+          <w:sz w:val="24"/>
+          <w:szCs w:val="24"/>
+        </w:rPr>
+        <w:t>s</w:t>
+      </w:r>
+      <w:r>
+        <w:rPr>
+          <w:sz w:val="24"/>
+          <w:szCs w:val="24"/>
+        </w:rPr>
+        <w:t xml:space="preserve"> of two types of languages: the machine code and the assembly language.</w:t>
+      </w:r>
+    </w:p>
+    <w:p>
+      <w:pPr>
+        <w:pStyle w:val="Heading2"/>
+      </w:pPr>
+      <w:r>
+        <w:t>Machine code</w:t>
+      </w:r>
+    </w:p>
+    <w:p>
+      <w:pPr>
+        <w:rPr>
+          <w:sz w:val="24"/>
+          <w:szCs w:val="24"/>
+        </w:rPr>
+      </w:pPr>
+      <w:r>
+        <w:rPr>
+          <w:sz w:val="24"/>
+          <w:szCs w:val="24"/>
+        </w:rPr>
+        <w:t xml:space="preserve">The computer executes the machine codes, the binary 0 and 1. The high-level languages needs to be converted to the machine code. The machine code of different computers </w:t>
+      </w:r>
+      <w:proofErr w:type="gramStart"/>
+      <w:r>
+        <w:rPr>
+          <w:sz w:val="24"/>
+          <w:szCs w:val="24"/>
+        </w:rPr>
+        <w:t>are</w:t>
+      </w:r>
+      <w:proofErr w:type="gramEnd"/>
+      <w:r>
+        <w:rPr>
+          <w:sz w:val="24"/>
+          <w:szCs w:val="24"/>
+        </w:rPr>
+        <w:t xml:space="preserve"> different so the program written in machine code may not run on another computer, it is why the low-level codes are non-portable. </w:t>
+      </w:r>
+    </w:p>
+    <w:p>
+      <w:pPr>
+        <w:rPr>
+          <w:sz w:val="24"/>
+          <w:szCs w:val="24"/>
+        </w:rPr>
+      </w:pPr>
+      <w:r>
+        <w:rPr>
+          <w:sz w:val="24"/>
+          <w:szCs w:val="24"/>
+        </w:rPr>
+        <w:t>For example: 0101 1101</w:t>
+      </w:r>
+    </w:p>
+    <w:p>
+      <w:pPr>
+        <w:pStyle w:val="Heading2"/>
+      </w:pPr>
+      <w:r>
+        <w:t>Assembly Language</w:t>
+      </w:r>
+    </w:p>
+    <w:p>
+      <w:pPr>
+        <w:rPr>
+          <w:sz w:val="24"/>
+          <w:szCs w:val="24"/>
+        </w:rPr>
+      </w:pPr>
+      <w:r>
+        <w:rPr>
+          <w:sz w:val="24"/>
+          <w:szCs w:val="24"/>
+        </w:rPr>
+        <w:t xml:space="preserve">The assembly language is in the mid of the Machine code and high-level languages. The codes of assembly language are represented by mnemonic. Mnemonics of assembly language acts like commands, include MOV, PUSH, POP, XCHG, ADD, SUB. The high-levels are converted first to the assembly language and then machine code. </w:t>
+      </w:r>
+    </w:p>
+    <w:p>
+      <w:pPr>
+        <w:rPr>
+          <w:sz w:val="24"/>
+          <w:szCs w:val="24"/>
+        </w:rPr>
+      </w:pPr>
+      <w:r>
+        <w:rPr>
+          <w:sz w:val="24"/>
+          <w:szCs w:val="24"/>
+        </w:rPr>
+        <w:t xml:space="preserve">For example, </w:t>
+      </w:r>
+    </w:p>
+    <w:p>
+      <w:pPr>
+        <w:ind w:left="720" w:firstLine="720"/>
+        <w:rPr>
+          <w:sz w:val="24"/>
+          <w:szCs w:val="24"/>
+        </w:rPr>
+      </w:pPr>
+      <w:r>
+        <w:rPr>
+          <w:sz w:val="24"/>
+          <w:szCs w:val="24"/>
+        </w:rPr>
+        <w:t>LDD count</w:t>
+      </w:r>
+    </w:p>
+    <w:p>
+      <w:pPr>
+        <w:ind w:left="720" w:firstLine="720"/>
+        <w:rPr>
+          <w:sz w:val="24"/>
+          <w:szCs w:val="24"/>
+        </w:rPr>
+      </w:pPr>
+      <w:r>
+        <w:rPr>
+          <w:sz w:val="24"/>
+          <w:szCs w:val="24"/>
+        </w:rPr>
+        <w:t>ADD 1</w:t>
+      </w:r>
+    </w:p>
+    <w:p>
+      <w:pPr>
+        <w:ind w:left="720" w:firstLine="720"/>
+        <w:rPr>
+          <w:sz w:val="24"/>
+          <w:szCs w:val="24"/>
+        </w:rPr>
+      </w:pPr>
+      <w:r>
+        <w:rPr>
+          <w:sz w:val="24"/>
+          <w:szCs w:val="24"/>
+        </w:rPr>
+        <w:t>STO count</w:t>
+      </w:r>
+    </w:p>
+    <w:p>
+      <w:pPr>
+        <w:rPr>
+          <w:sz w:val="24"/>
+          <w:szCs w:val="24"/>
+        </w:rPr>
+      </w:pPr>
+      <w:r>
+        <w:rPr>
+          <w:sz w:val="24"/>
+          <w:szCs w:val="24"/>
+        </w:rPr>
+        <w:t>The example of the assembly language is just “count = count + 1”</w:t>
+      </w:r>
+      <w:r>
+        <w:rPr>
+          <w:sz w:val="24"/>
+          <w:szCs w:val="24"/>
+        </w:rPr>
+        <w:t>.</w:t>
+      </w:r>
+    </w:p>
+    <w:p>
+      <w:pPr>
+        <w:rPr>
+          <w:sz w:val="24"/>
+          <w:szCs w:val="24"/>
+        </w:rPr>
+      </w:pPr>
     </w:p>
     <w:sectPr>
       <w:pgSz w:w="12240" w:h="15840"/>
@@ -750,9 +1273,9 @@
     </w:lvl>
   </w:abstractNum>
   <w:abstractNum w:abstractNumId="1" w15:restartNumberingAfterBreak="0">
-    <w:nsid w:val="7F343F67"/>
+    <w:nsid w:val="7A8A5977"/>
     <w:multiLevelType w:val="hybridMultilevel"/>
-    <w:tmpl w:val="21BA45C0"/>
+    <w:tmpl w:val="34B216DA"/>
     <w:lvl w:ilvl="0" w:tplc="0409000F">
       <w:start w:val="1"/>
       <w:numFmt w:val="decimal"/>
@@ -838,11 +1361,103 @@
       </w:pPr>
     </w:lvl>
   </w:abstractNum>
+  <w:abstractNum w:abstractNumId="2" w15:restartNumberingAfterBreak="0">
+    <w:nsid w:val="7F343F67"/>
+    <w:multiLevelType w:val="hybridMultilevel"/>
+    <w:tmpl w:val="21BA45C0"/>
+    <w:lvl w:ilvl="0" w:tplc="0409000F">
+      <w:start w:val="1"/>
+      <w:numFmt w:val="decimal"/>
+      <w:lvlText w:val="%1."/>
+      <w:lvlJc w:val="left"/>
+      <w:pPr>
+        <w:ind w:left="720" w:hanging="360"/>
+      </w:pPr>
+      <w:rPr>
+        <w:rFonts w:hint="default"/>
+      </w:rPr>
+    </w:lvl>
+    <w:lvl w:ilvl="1" w:tplc="04090019" w:tentative="1">
+      <w:start w:val="1"/>
+      <w:numFmt w:val="lowerLetter"/>
+      <w:lvlText w:val="%2."/>
+      <w:lvlJc w:val="left"/>
+      <w:pPr>
+        <w:ind w:left="1440" w:hanging="360"/>
+      </w:pPr>
+    </w:lvl>
+    <w:lvl w:ilvl="2" w:tplc="0409001B" w:tentative="1">
+      <w:start w:val="1"/>
+      <w:numFmt w:val="lowerRoman"/>
+      <w:lvlText w:val="%3."/>
+      <w:lvlJc w:val="right"/>
+      <w:pPr>
+        <w:ind w:left="2160" w:hanging="180"/>
+      </w:pPr>
+    </w:lvl>
+    <w:lvl w:ilvl="3" w:tplc="0409000F" w:tentative="1">
+      <w:start w:val="1"/>
+      <w:numFmt w:val="decimal"/>
+      <w:lvlText w:val="%4."/>
+      <w:lvlJc w:val="left"/>
+      <w:pPr>
+        <w:ind w:left="2880" w:hanging="360"/>
+      </w:pPr>
+    </w:lvl>
+    <w:lvl w:ilvl="4" w:tplc="04090019" w:tentative="1">
+      <w:start w:val="1"/>
+      <w:numFmt w:val="lowerLetter"/>
+      <w:lvlText w:val="%5."/>
+      <w:lvlJc w:val="left"/>
+      <w:pPr>
+        <w:ind w:left="3600" w:hanging="360"/>
+      </w:pPr>
+    </w:lvl>
+    <w:lvl w:ilvl="5" w:tplc="0409001B" w:tentative="1">
+      <w:start w:val="1"/>
+      <w:numFmt w:val="lowerRoman"/>
+      <w:lvlText w:val="%6."/>
+      <w:lvlJc w:val="right"/>
+      <w:pPr>
+        <w:ind w:left="4320" w:hanging="180"/>
+      </w:pPr>
+    </w:lvl>
+    <w:lvl w:ilvl="6" w:tplc="0409000F" w:tentative="1">
+      <w:start w:val="1"/>
+      <w:numFmt w:val="decimal"/>
+      <w:lvlText w:val="%7."/>
+      <w:lvlJc w:val="left"/>
+      <w:pPr>
+        <w:ind w:left="5040" w:hanging="360"/>
+      </w:pPr>
+    </w:lvl>
+    <w:lvl w:ilvl="7" w:tplc="04090019" w:tentative="1">
+      <w:start w:val="1"/>
+      <w:numFmt w:val="lowerLetter"/>
+      <w:lvlText w:val="%8."/>
+      <w:lvlJc w:val="left"/>
+      <w:pPr>
+        <w:ind w:left="5760" w:hanging="360"/>
+      </w:pPr>
+    </w:lvl>
+    <w:lvl w:ilvl="8" w:tplc="0409001B" w:tentative="1">
+      <w:start w:val="1"/>
+      <w:numFmt w:val="lowerRoman"/>
+      <w:lvlText w:val="%9."/>
+      <w:lvlJc w:val="right"/>
+      <w:pPr>
+        <w:ind w:left="6480" w:hanging="180"/>
+      </w:pPr>
+    </w:lvl>
+  </w:abstractNum>
   <w:num w:numId="1" w16cid:durableId="1357999611">
-    <w:abstractNumId w:val="1"/>
+    <w:abstractNumId w:val="2"/>
   </w:num>
   <w:num w:numId="2" w16cid:durableId="559563975">
     <w:abstractNumId w:val="0"/>
+  </w:num>
+  <w:num w:numId="3" w16cid:durableId="189803623">
+    <w:abstractNumId w:val="1"/>
   </w:num>
 </w:numbering>
 </file>
@@ -1786,6 +2401,29 @@
       </w:tblBorders>
     </w:tblPr>
   </w:style>
+  <w:style w:type="character" w:styleId="Hyperlink">
+    <w:name w:val="Hyperlink"/>
+    <w:basedOn w:val="DefaultParagraphFont"/>
+    <w:uiPriority w:val="99"/>
+    <w:unhideWhenUsed/>
+    <w:rsid w:val="005F33F5"/>
+    <w:rPr>
+      <w:color w:val="0000FF" w:themeColor="hyperlink"/>
+      <w:u w:val="single"/>
+    </w:rPr>
+  </w:style>
+  <w:style w:type="character" w:styleId="UnresolvedMention">
+    <w:name w:val="Unresolved Mention"/>
+    <w:basedOn w:val="DefaultParagraphFont"/>
+    <w:uiPriority w:val="99"/>
+    <w:semiHidden/>
+    <w:unhideWhenUsed/>
+    <w:rsid w:val="005F33F5"/>
+    <w:rPr>
+      <w:color w:val="605E5C"/>
+      <w:shd w:val="clear" w:color="auto" w:fill="E1DFDD"/>
+    </w:rPr>
+  </w:style>
 </w:styles>
 </file>
 
@@ -2072,4 +2710,16 @@
   <a:objectDefaults/>
   <a:extraClrSchemeLst/>
 </a:theme>
+</file>
+
+<file path=customXml/item1.xml><?xml version="1.0" encoding="utf-8"?>
+<b:Sources xmlns:b="http://schemas.openxmlformats.org/officeDocument/2006/bibliography" xmlns="http://schemas.openxmlformats.org/officeDocument/2006/bibliography" SelectedStyle="\APASixthEditionOfficeOnline.xsl" StyleName="APA" Version="6"/>
+</file>
+
+<file path=customXml/itemProps1.xml><?xml version="1.0" encoding="utf-8"?>
+<ds:datastoreItem xmlns:ds="http://schemas.openxmlformats.org/officeDocument/2006/customXml" ds:itemID="{39182BD1-BC1B-449F-B922-6587D1E1FE8A}">
+  <ds:schemaRefs>
+    <ds:schemaRef ds:uri="http://schemas.openxmlformats.org/officeDocument/2006/bibliography"/>
+  </ds:schemaRefs>
+</ds:datastoreItem>
 </file>
</xml_diff>